<commit_message>
Add ViT milestone results and updated assignment report
</commit_message>
<xml_diff>
--- a/assignments/Week_8_Project_Report_RobustDeep.docx
+++ b/assignments/Week_8_Project_Report_RobustDeep.docx
@@ -343,6 +343,56 @@
                 <w:b w:val="0"/>
                 <w:sz w:val="18"/>
               </w:rPr>
+              <w:t>Train an initial ViT/hybrid model</w:t>
+            </w:r>
+          </w:p>
+        </w:tc>
+        <w:tc>
+          <w:tcPr>
+            <w:tcW w:type="dxa" w:w="3312"/>
+            <w:vAlign w:val="center"/>
+          </w:tcPr>
+          <w:p>
+            <w:r/>
+            <w:r>
+              <w:rPr>
+                <w:b w:val="0"/>
+                <w:sz w:val="18"/>
+              </w:rPr>
+              <w:t>ViT-Small trained for one epoch on the same real FF++ split with saved evaluation artifacts.</w:t>
+            </w:r>
+          </w:p>
+        </w:tc>
+        <w:tc>
+          <w:tcPr>
+            <w:tcW w:type="dxa" w:w="3312"/>
+            <w:vAlign w:val="center"/>
+          </w:tcPr>
+          <w:p>
+            <w:r/>
+            <w:r>
+              <w:rPr>
+                <w:b w:val="0"/>
+                <w:sz w:val="18"/>
+              </w:rPr>
+              <w:t>Completed for subset</w:t>
+            </w:r>
+          </w:p>
+        </w:tc>
+      </w:tr>
+      <w:tr>
+        <w:tc>
+          <w:tcPr>
+            <w:tcW w:type="dxa" w:w="3312"/>
+            <w:vAlign w:val="center"/>
+          </w:tcPr>
+          <w:p>
+            <w:r/>
+            <w:r>
+              <w:rPr>
+                <w:b w:val="0"/>
+                <w:sz w:val="18"/>
+              </w:rPr>
               <w:t>Train Celeb-DF and DFDC</w:t>
             </w:r>
           </w:p>
@@ -507,6 +557,16 @@
     <w:p>
       <w:r>
         <w:t>C:\Users\Lenovo\Downloads\robustdeep\robustdeep\artifacts\models\ff_c23_subset10\best.pt</w:t>
+      </w:r>
+    </w:p>
+    <w:p>
+      <w:r>
+        <w:t>Initial ViT-Small checkpoint:</w:t>
+      </w:r>
+    </w:p>
+    <w:p>
+      <w:r>
+        <w:t>C:\Users\Lenovo\Downloads\robustdeep\robustdeep\artifacts\models\ff_c23_vit_small_milestone\best.pt</w:t>
       </w:r>
     </w:p>
     <w:p>
@@ -934,6 +994,234 @@
                 <w:b w:val="0"/>
                 <w:sz w:val="18"/>
               </w:rPr>
+              <w:t>FaceForensics++ c23</w:t>
+            </w:r>
+          </w:p>
+        </w:tc>
+        <w:tc>
+          <w:tcPr>
+            <w:tcW w:type="dxa" w:w="1419"/>
+            <w:vAlign w:val="center"/>
+          </w:tcPr>
+          <w:p>
+            <w:r/>
+            <w:r>
+              <w:rPr>
+                <w:b w:val="0"/>
+                <w:sz w:val="18"/>
+              </w:rPr>
+              <w:t>ViT-Small</w:t>
+            </w:r>
+          </w:p>
+        </w:tc>
+        <w:tc>
+          <w:tcPr>
+            <w:tcW w:type="dxa" w:w="1419"/>
+            <w:vAlign w:val="center"/>
+          </w:tcPr>
+          <w:p>
+            <w:r/>
+            <w:r>
+              <w:rPr>
+                <w:b w:val="0"/>
+                <w:sz w:val="18"/>
+              </w:rPr>
+              <w:t>Validation</w:t>
+            </w:r>
+          </w:p>
+        </w:tc>
+        <w:tc>
+          <w:tcPr>
+            <w:tcW w:type="dxa" w:w="1419"/>
+            <w:vAlign w:val="center"/>
+          </w:tcPr>
+          <w:p>
+            <w:r/>
+            <w:r>
+              <w:rPr>
+                <w:b w:val="0"/>
+                <w:sz w:val="18"/>
+              </w:rPr>
+              <w:t>7</w:t>
+            </w:r>
+          </w:p>
+        </w:tc>
+        <w:tc>
+          <w:tcPr>
+            <w:tcW w:type="dxa" w:w="1419"/>
+            <w:vAlign w:val="center"/>
+          </w:tcPr>
+          <w:p>
+            <w:r/>
+            <w:r>
+              <w:rPr>
+                <w:b w:val="0"/>
+                <w:sz w:val="18"/>
+              </w:rPr>
+              <w:t>0.7143</w:t>
+            </w:r>
+          </w:p>
+        </w:tc>
+        <w:tc>
+          <w:tcPr>
+            <w:tcW w:type="dxa" w:w="1419"/>
+            <w:vAlign w:val="center"/>
+          </w:tcPr>
+          <w:p>
+            <w:r/>
+            <w:r>
+              <w:rPr>
+                <w:b w:val="0"/>
+                <w:sz w:val="18"/>
+              </w:rPr>
+              <w:t>0.9000</w:t>
+            </w:r>
+          </w:p>
+        </w:tc>
+        <w:tc>
+          <w:tcPr>
+            <w:tcW w:type="dxa" w:w="1419"/>
+            <w:vAlign w:val="center"/>
+          </w:tcPr>
+          <w:p>
+            <w:r/>
+            <w:r>
+              <w:rPr>
+                <w:b w:val="0"/>
+                <w:sz w:val="18"/>
+              </w:rPr>
+              <w:t>0.8333 / 0.1000</w:t>
+            </w:r>
+          </w:p>
+        </w:tc>
+      </w:tr>
+      <w:tr>
+        <w:tc>
+          <w:tcPr>
+            <w:tcW w:type="dxa" w:w="1419"/>
+            <w:vAlign w:val="center"/>
+          </w:tcPr>
+          <w:p>
+            <w:r/>
+            <w:r>
+              <w:rPr>
+                <w:b w:val="0"/>
+                <w:sz w:val="18"/>
+              </w:rPr>
+              <w:t>FaceForensics++ c23</w:t>
+            </w:r>
+          </w:p>
+        </w:tc>
+        <w:tc>
+          <w:tcPr>
+            <w:tcW w:type="dxa" w:w="1419"/>
+            <w:vAlign w:val="center"/>
+          </w:tcPr>
+          <w:p>
+            <w:r/>
+            <w:r>
+              <w:rPr>
+                <w:b w:val="0"/>
+                <w:sz w:val="18"/>
+              </w:rPr>
+              <w:t>ViT-Small</w:t>
+            </w:r>
+          </w:p>
+        </w:tc>
+        <w:tc>
+          <w:tcPr>
+            <w:tcW w:type="dxa" w:w="1419"/>
+            <w:vAlign w:val="center"/>
+          </w:tcPr>
+          <w:p>
+            <w:r/>
+            <w:r>
+              <w:rPr>
+                <w:b w:val="0"/>
+                <w:sz w:val="18"/>
+              </w:rPr>
+              <w:t>Test</w:t>
+            </w:r>
+          </w:p>
+        </w:tc>
+        <w:tc>
+          <w:tcPr>
+            <w:tcW w:type="dxa" w:w="1419"/>
+            <w:vAlign w:val="center"/>
+          </w:tcPr>
+          <w:p>
+            <w:r/>
+            <w:r>
+              <w:rPr>
+                <w:b w:val="0"/>
+                <w:sz w:val="18"/>
+              </w:rPr>
+              <w:t>8</w:t>
+            </w:r>
+          </w:p>
+        </w:tc>
+        <w:tc>
+          <w:tcPr>
+            <w:tcW w:type="dxa" w:w="1419"/>
+            <w:vAlign w:val="center"/>
+          </w:tcPr>
+          <w:p>
+            <w:r/>
+            <w:r>
+              <w:rPr>
+                <w:b w:val="0"/>
+                <w:sz w:val="18"/>
+              </w:rPr>
+              <w:t>0.7500</w:t>
+            </w:r>
+          </w:p>
+        </w:tc>
+        <w:tc>
+          <w:tcPr>
+            <w:tcW w:type="dxa" w:w="1419"/>
+            <w:vAlign w:val="center"/>
+          </w:tcPr>
+          <w:p>
+            <w:r/>
+            <w:r>
+              <w:rPr>
+                <w:b w:val="0"/>
+                <w:sz w:val="18"/>
+              </w:rPr>
+              <w:t>0.0000</w:t>
+            </w:r>
+          </w:p>
+        </w:tc>
+        <w:tc>
+          <w:tcPr>
+            <w:tcW w:type="dxa" w:w="1419"/>
+            <w:vAlign w:val="center"/>
+          </w:tcPr>
+          <w:p>
+            <w:r/>
+            <w:r>
+              <w:rPr>
+                <w:b w:val="0"/>
+                <w:sz w:val="18"/>
+              </w:rPr>
+              <w:t>0.8571 / 1.0000</w:t>
+            </w:r>
+          </w:p>
+        </w:tc>
+      </w:tr>
+      <w:tr>
+        <w:tc>
+          <w:tcPr>
+            <w:tcW w:type="dxa" w:w="1419"/>
+            <w:vAlign w:val="center"/>
+          </w:tcPr>
+          <w:p>
+            <w:r/>
+            <w:r>
+              <w:rPr>
+                <w:b w:val="0"/>
+                <w:sz w:val="18"/>
+              </w:rPr>
               <w:t>Celeb-DF v2</w:t>
             </w:r>
           </w:p>
@@ -1170,6 +1458,11 @@
       </w:r>
     </w:p>
     <w:p>
+      <w:r>
+        <w:t>The initial ViT-Small run completed one epoch with validation AUROC 0.9000 and test AUROC 0.0000. The validation/test gap is recorded as a failure-analysis result, not hidden by reporting validation performance as the final benchmark.</w:t>
+      </w:r>
+    </w:p>
+    <w:p>
       <w:pPr>
         <w:pStyle w:val="Heading1"/>
         <w:keepNext/>
@@ -1279,8 +1572,55 @@
       <w:r>
         <w:drawing>
           <wp:inline xmlns:a="http://schemas.openxmlformats.org/drawingml/2006/main" xmlns:pic="http://schemas.openxmlformats.org/drawingml/2006/picture">
+            <wp:extent cx="5029200" cy="4023360"/>
+            <wp:docPr id="3" name="Picture 3"/>
+            <wp:cNvGraphicFramePr>
+              <a:graphicFrameLocks noChangeAspect="1"/>
+            </wp:cNvGraphicFramePr>
+            <a:graphic>
+              <a:graphicData uri="http://schemas.openxmlformats.org/drawingml/2006/picture">
+                <pic:pic>
+                  <pic:nvPicPr>
+                    <pic:cNvPr id="0" name="roc_test.png"/>
+                    <pic:cNvPicPr/>
+                  </pic:nvPicPr>
+                  <pic:blipFill>
+                    <a:blip r:embed="rId11"/>
+                    <a:stretch>
+                      <a:fillRect/>
+                    </a:stretch>
+                  </pic:blipFill>
+                  <pic:spPr>
+                    <a:xfrm>
+                      <a:off x="0" y="0"/>
+                      <a:ext cx="5029200" cy="4023360"/>
+                    </a:xfrm>
+                    <a:prstGeom prst="rect"/>
+                  </pic:spPr>
+                </pic:pic>
+              </a:graphicData>
+            </a:graphic>
+          </wp:inline>
+        </w:drawing>
+      </w:r>
+    </w:p>
+    <w:p>
+      <w:pPr>
+        <w:pStyle w:val="Caption"/>
+      </w:pPr>
+      <w:r>
+        <w:t>Figure 3. REAL DATA FaceForensics++ ViT-Small test ROC curve.</w:t>
+      </w:r>
+    </w:p>
+    <w:p>
+      <w:pPr>
+        <w:jc w:val="center"/>
+      </w:pPr>
+      <w:r>
+        <w:drawing>
+          <wp:inline xmlns:a="http://schemas.openxmlformats.org/drawingml/2006/main" xmlns:pic="http://schemas.openxmlformats.org/drawingml/2006/picture">
             <wp:extent cx="5029200" cy="2514600"/>
-            <wp:docPr id="3" name="Picture 3"/>
+            <wp:docPr id="4" name="Picture 4"/>
             <wp:cNvGraphicFramePr>
               <a:graphicFrameLocks noChangeAspect="1"/>
             </wp:cNvGraphicFramePr>
@@ -1292,7 +1632,7 @@
                     <pic:cNvPicPr/>
                   </pic:nvPicPr>
                   <pic:blipFill>
-                    <a:blip r:embed="rId11"/>
+                    <a:blip r:embed="rId12"/>
                     <a:stretch>
                       <a:fillRect/>
                     </a:stretch>
@@ -1316,7 +1656,7 @@
         <w:pStyle w:val="Caption"/>
       </w:pPr>
       <w:r>
-        <w:t>Figure 3. Model attribution visualization; attribution is not forensic proof.</w:t>
+        <w:t>Figure 4. Model attribution visualization; attribution is not forensic proof.</w:t>
       </w:r>
     </w:p>
     <w:p>
@@ -1334,6 +1674,14 @@
       </w:pPr>
       <w:r>
         <w:t>Complete a stable multi-epoch run on a GPU or a smaller controlled subset, then compare only using the untouched test split.</w:t>
+      </w:r>
+    </w:p>
+    <w:p>
+      <w:pPr>
+        <w:pStyle w:val="ListBullet"/>
+      </w:pPr>
+      <w:r>
+        <w:t>The ViT-Small validation/test gap is a failure-analysis result; do not report the validation AUROC as its final test score.</w:t>
       </w:r>
     </w:p>
     <w:p>
@@ -1412,6 +1760,18 @@
           <w:sz w:val="18"/>
         </w:rPr>
         <w:t>python scripts/train.py --dataset faceforensics --model efficientnet_b0 --epochs 5 --max-videos 50 --experiment-id ff_c23_subset10</w:t>
+      </w:r>
+    </w:p>
+    <w:p>
+      <w:pPr>
+        <w:pStyle w:val="NoSpacing"/>
+      </w:pPr>
+      <w:r>
+        <w:rPr>
+          <w:rFonts w:ascii="Consolas" w:hAnsi="Consolas"/>
+          <w:sz w:val="18"/>
+        </w:rPr>
+        <w:t>python scripts/train.py --dataset faceforensics --model vit_small --epochs 1 --max-videos 50 --num-workers 0 --experiment-id ff_c23_vit_small_milestone</w:t>
       </w:r>
     </w:p>
     <w:p>

</xml_diff>